<commit_message>
feat(resume): complete Repair-021 A4 tailoring, authoritative job snapshot, skill provenance, and Studio resilience
</commit_message>
<xml_diff>
--- a/output/resume-studio/screenshots/integrated.docx
+++ b/output/resume-studio/screenshots/integrated.docx
@@ -1,6 +1,6 @@
 
 <file path=word/document.xml><?xml version="1.0" encoding="utf-8"?>
-<w:document xmlns:w="http://schemas.openxmlformats.org/wordprocessingml/2006/main">
+<w:document xmlns:w="http://schemas.openxmlformats.org/wordprocessingml/2006/main" xmlns:r="http://schemas.openxmlformats.org/officeDocument/2006/relationships">
   <w:body>
     <w:p>
       <w:pPr>
@@ -22,17 +22,29 @@
       <w:pPr>
         <w:pStyle w:val="Normal"/>
       </w:pPr>
-      <w:r>
-        <w:t xml:space="preserve">https://github.com/source-fixture</w:t>
-      </w:r>
-    </w:p>
-    <w:p>
-      <w:pPr>
-        <w:pStyle w:val="Normal"/>
-      </w:pPr>
-      <w:r>
-        <w:t xml:space="preserve">https://portfolio.example.test</w:t>
-      </w:r>
+      <w:hyperlink r:id="rId3" w:history="1">
+        <w:r>
+          <w:rPr>
+            <w:rStyle w:val="Hyperlink"/>
+            <w:color w:val="000000"/>
+            <w:u w:val="none"/>
+          </w:rPr>
+          <w:t xml:space="preserve">github.com/source-fixture</w:t>
+        </w:r>
+      </w:hyperlink>
+      <w:r>
+        <w:t xml:space="preserve"> | </w:t>
+      </w:r>
+      <w:hyperlink r:id="rId4" w:history="1">
+        <w:r>
+          <w:rPr>
+            <w:rStyle w:val="Hyperlink"/>
+            <w:color w:val="000000"/>
+            <w:u w:val="none"/>
+          </w:rPr>
+          <w:t xml:space="preserve">portfolio.example.test</w:t>
+        </w:r>
+      </w:hyperlink>
     </w:p>
     <w:p>
       <w:pPr>
@@ -298,8 +310,18 @@
           <w:numId w:val="1"/>
         </w:numPr>
       </w:pPr>
-      <w:r>
-        <w:t xml:space="preserve">Source Credential | Source Board | Issued: Jan 2023 | Expires: Jan 2027 | ID: SOURCE-CRED | https://credential.example.test/source</w:t>
+      <w:hyperlink r:id="rId5" w:history="1">
+        <w:r>
+          <w:rPr>
+            <w:rStyle w:val="Hyperlink"/>
+            <w:color w:val="000000"/>
+            <w:u w:val="none"/>
+          </w:rPr>
+          <w:t xml:space="preserve">Source Credential</w:t>
+        </w:r>
+      </w:hyperlink>
+      <w:r>
+        <w:t xml:space="preserve"> — Source Board | SOURCE-CRED | Jan 2023 | Jan 2027</w:t>
       </w:r>
     </w:p>
     <w:p>
@@ -419,5 +441,15 @@
       <w:szCs w:val="20"/>
     </w:rPr>
   </w:style>
+  <w:style w:type="character" w:styleId="Hyperlink">
+    <w:name w:val="Hyperlink"/>
+    <w:basedOn w:val="DefaultParagraphFont"/>
+    <w:uiPriority w:val="99"/>
+    <w:unhideWhenUsed/>
+    <w:rPr>
+      <w:color w:val="000000"/>
+      <w:u w:val="none"/>
+    </w:rPr>
+  </w:style>
 </w:styles>
 </file>
</xml_diff>